<commit_message>
feat(report): stack figures single-column and mark per-metric winners
Two report-readability tweaks.

Figures: the grid flowed two to three per row and resized responsively, so the
same report showed one image on some rows and two on others. Switch it to a
single fixed-width (600px) column, left-aligned, so every figure stacks one
under another at the same size.

Ranking tables: mark the best value in each metric row with a checkmark, so the
per-metric leader is visible at a glance (smallest gap, highest softness,
most-negative E_ads, highest score). Metrics with no defensible single best
(delta-N, the metal-O distance, TNC) stay unmarked; the overall-lead column
stays highlighted. HTML and Word share the winner logic via ranking_matrix;
goldens and the arghel bundle regenerated.

Co-Authored-By: Claude Opus 4.8 <noreply@anthropic.com>
</commit_message>
<xml_diff>
--- a/cases/arghel/report/report.docx
+++ b/cases/arghel/report/report.docx
@@ -16,7 +16,7 @@
           <w:b w:val="0"/>
           <w:color w:val="718096"/>
         </w:rPr>
-        <w:t>Substrate: Fe(110)  |  Medium: 1 M HCl  |  DFT level: B3LYP/6-311++G(d,p) (ddCOSMO:water)  |  Generated 2026-07-10 14:44</w:t>
+        <w:t>Substrate: Fe(110)  |  Medium: 1 M HCl  |  DFT level: B3LYP/6-311++G(d,p) (ddCOSMO:water)  |  Generated 2026-07-10 15:13</w:t>
       </w:r>
     </w:p>
     <w:p>
@@ -213,7 +213,7 @@
                 <w:b/>
                 <w:sz w:val="17"/>
               </w:rPr>
-              <w:t>4.082</w:t>
+              <w:t>4.082 ✓</w:t>
             </w:r>
           </w:p>
         </w:tc>
@@ -271,7 +271,7 @@
                 <w:b/>
                 <w:sz w:val="17"/>
               </w:rPr>
-              <w:t>2.041</w:t>
+              <w:t>2.041 ✓</w:t>
             </w:r>
           </w:p>
         </w:tc>
@@ -329,7 +329,7 @@
                 <w:b/>
                 <w:sz w:val="17"/>
               </w:rPr>
-              <w:t>0.49</w:t>
+              <w:t>0.49 ✓</w:t>
             </w:r>
           </w:p>
         </w:tc>
@@ -459,7 +459,7 @@
                 <w:b w:val="0"/>
                 <w:sz w:val="17"/>
               </w:rPr>
-              <w:t>-16.74</w:t>
+              <w:t>-16.74 ✓</w:t>
             </w:r>
           </w:p>
         </w:tc>
@@ -561,7 +561,7 @@
                 <w:b/>
                 <w:sz w:val="17"/>
               </w:rPr>
-              <w:t>0.995</w:t>
+              <w:t>0.995 ✓</w:t>
             </w:r>
           </w:p>
         </w:tc>
@@ -2094,7 +2094,7 @@
                 <w:b/>
                 <w:sz w:val="17"/>
               </w:rPr>
-              <w:t>3.604</w:t>
+              <w:t>3.604 ✓</w:t>
             </w:r>
           </w:p>
         </w:tc>
@@ -2152,7 +2152,7 @@
                 <w:b/>
                 <w:sz w:val="17"/>
               </w:rPr>
-              <w:t>1.802</w:t>
+              <w:t>1.802 ✓</w:t>
             </w:r>
           </w:p>
         </w:tc>
@@ -2210,7 +2210,7 @@
                 <w:b/>
                 <w:sz w:val="17"/>
               </w:rPr>
-              <w:t>0.555</w:t>
+              <w:t>0.555 ✓</w:t>
             </w:r>
           </w:p>
         </w:tc>
@@ -2384,7 +2384,7 @@
                 <w:b/>
                 <w:sz w:val="17"/>
               </w:rPr>
-              <w:t>1.413</w:t>
+              <w:t>1.413 ✓</w:t>
             </w:r>
           </w:p>
         </w:tc>

</xml_diff>

<commit_message>
feat(report): stack figures single-column and mark per-metric winners (#192)
Two report-readability tweaks.

Figures: the grid flowed two to three per row and resized responsively, so the
same report showed one image on some rows and two on others. Switch it to a
single fixed-width (600px) column, left-aligned, so every figure stacks one
under another at the same size.

Ranking tables: mark the best value in each metric row with a checkmark, so the
per-metric leader is visible at a glance (smallest gap, highest softness,
most-negative E_ads, highest score). Metrics with no defensible single best
(delta-N, the metal-O distance, TNC) stay unmarked; the overall-lead column
stays highlighted. HTML and Word share the winner logic via ranking_matrix;
goldens and the arghel bundle regenerated.

Co-authored-by: Claude Opus 4.8 <noreply@anthropic.com>
</commit_message>
<xml_diff>
--- a/cases/arghel/report/report.docx
+++ b/cases/arghel/report/report.docx
@@ -16,7 +16,7 @@
           <w:b w:val="0"/>
           <w:color w:val="718096"/>
         </w:rPr>
-        <w:t>Substrate: Fe(110)  |  Medium: 1 M HCl  |  DFT level: B3LYP/6-311++G(d,p) (ddCOSMO:water)  |  Generated 2026-07-10 14:44</w:t>
+        <w:t>Substrate: Fe(110)  |  Medium: 1 M HCl  |  DFT level: B3LYP/6-311++G(d,p) (ddCOSMO:water)  |  Generated 2026-07-10 15:13</w:t>
       </w:r>
     </w:p>
     <w:p>
@@ -213,7 +213,7 @@
                 <w:b/>
                 <w:sz w:val="17"/>
               </w:rPr>
-              <w:t>4.082</w:t>
+              <w:t>4.082 ✓</w:t>
             </w:r>
           </w:p>
         </w:tc>
@@ -271,7 +271,7 @@
                 <w:b/>
                 <w:sz w:val="17"/>
               </w:rPr>
-              <w:t>2.041</w:t>
+              <w:t>2.041 ✓</w:t>
             </w:r>
           </w:p>
         </w:tc>
@@ -329,7 +329,7 @@
                 <w:b/>
                 <w:sz w:val="17"/>
               </w:rPr>
-              <w:t>0.49</w:t>
+              <w:t>0.49 ✓</w:t>
             </w:r>
           </w:p>
         </w:tc>
@@ -459,7 +459,7 @@
                 <w:b w:val="0"/>
                 <w:sz w:val="17"/>
               </w:rPr>
-              <w:t>-16.74</w:t>
+              <w:t>-16.74 ✓</w:t>
             </w:r>
           </w:p>
         </w:tc>
@@ -561,7 +561,7 @@
                 <w:b/>
                 <w:sz w:val="17"/>
               </w:rPr>
-              <w:t>0.995</w:t>
+              <w:t>0.995 ✓</w:t>
             </w:r>
           </w:p>
         </w:tc>
@@ -2094,7 +2094,7 @@
                 <w:b/>
                 <w:sz w:val="17"/>
               </w:rPr>
-              <w:t>3.604</w:t>
+              <w:t>3.604 ✓</w:t>
             </w:r>
           </w:p>
         </w:tc>
@@ -2152,7 +2152,7 @@
                 <w:b/>
                 <w:sz w:val="17"/>
               </w:rPr>
-              <w:t>1.802</w:t>
+              <w:t>1.802 ✓</w:t>
             </w:r>
           </w:p>
         </w:tc>
@@ -2210,7 +2210,7 @@
                 <w:b/>
                 <w:sz w:val="17"/>
               </w:rPr>
-              <w:t>0.555</w:t>
+              <w:t>0.555 ✓</w:t>
             </w:r>
           </w:p>
         </w:tc>
@@ -2384,7 +2384,7 @@
                 <w:b/>
                 <w:sz w:val="17"/>
               </w:rPr>
-              <w:t>1.413</w:t>
+              <w:t>1.413 ✓</w:t>
             </w:r>
           </w:p>
         </w:tc>

</xml_diff>

<commit_message>
feat(report): capitalise molecule names in the report tables too
Client review: finish the capitalisation for full consistency — the report's
own tables still showed lowercase names while the figures were capitalised.

Route every molecule-name-as-header/label through display_name:
- the transposed descriptor and ranking/summary tables (via _matrix and
  ranking_matrix, shared by the HTML and Word renderers), the computed-pKaH
  table, the lead-by-basis "Top candidate" cells, and the Fukui donor-site list.

Data lookups and the running prose keep the raw lowercase name (a chemical name
mid-sentence is a common noun); only displayed table headers/labels capitalise.
Refreshed the report goldens (the diff is name capitalisation only) and updated
the header assertions in test_report.

Co-Authored-By: Claude Opus 4.8 <noreply@anthropic.com>
</commit_message>
<xml_diff>
--- a/cases/arghel/report/report.docx
+++ b/cases/arghel/report/report.docx
@@ -16,7 +16,7 @@
           <w:b w:val="0"/>
           <w:color w:val="718096"/>
         </w:rPr>
-        <w:t>Substrate: Fe(110)  |  Medium: 1 M HCl  |  DFT level: B3LYP/6-311++G(d,p) (ddCOSMO:water)  |  Generated 2026-07-14 17:51</w:t>
+        <w:t>Substrate: Fe(110)  |  Medium: 1 M HCl  |  DFT level: B3LYP/6-311++G(d,p) (ddCOSMO:water)  |  Generated 2026-07-14 18:07</w:t>
       </w:r>
     </w:p>
     <w:p>
@@ -155,7 +155,7 @@
                 <w:b/>
                 <w:sz w:val="17"/>
               </w:rPr>
-              <w:t>quercetin</w:t>
+              <w:t>Quercetin</w:t>
             </w:r>
           </w:p>
         </w:tc>
@@ -169,7 +169,7 @@
                 <w:b/>
                 <w:sz w:val="17"/>
               </w:rPr>
-              <w:t>isorhamnetin</w:t>
+              <w:t>Isorhamnetin</w:t>
             </w:r>
           </w:p>
         </w:tc>
@@ -183,7 +183,7 @@
                 <w:b/>
                 <w:sz w:val="17"/>
               </w:rPr>
-              <w:t>kaempferol</w:t>
+              <w:t>Kaempferol</w:t>
             </w:r>
           </w:p>
         </w:tc>
@@ -660,7 +660,7 @@
                 <w:b w:val="0"/>
                 <w:sz w:val="17"/>
               </w:rPr>
-              <w:t>quercetin</w:t>
+              <w:t>Quercetin</w:t>
             </w:r>
           </w:p>
         </w:tc>
@@ -690,7 +690,7 @@
                 <w:b w:val="0"/>
                 <w:sz w:val="17"/>
               </w:rPr>
-              <w:t>quercetin</w:t>
+              <w:t>Quercetin</w:t>
             </w:r>
           </w:p>
         </w:tc>
@@ -720,7 +720,7 @@
                 <w:b w:val="0"/>
                 <w:sz w:val="17"/>
               </w:rPr>
-              <w:t>quercetin</w:t>
+              <w:t>Quercetin</w:t>
             </w:r>
           </w:p>
         </w:tc>
@@ -750,7 +750,7 @@
                 <w:b w:val="0"/>
                 <w:sz w:val="17"/>
               </w:rPr>
-              <w:t>quercetin</w:t>
+              <w:t>Quercetin</w:t>
             </w:r>
           </w:p>
         </w:tc>
@@ -1405,7 +1405,7 @@
                 <w:b/>
                 <w:sz w:val="17"/>
               </w:rPr>
-              <w:t>kaempferol</w:t>
+              <w:t>Kaempferol</w:t>
             </w:r>
           </w:p>
         </w:tc>
@@ -1419,7 +1419,7 @@
                 <w:b/>
                 <w:sz w:val="17"/>
               </w:rPr>
-              <w:t>quercetin</w:t>
+              <w:t>Quercetin</w:t>
             </w:r>
           </w:p>
         </w:tc>
@@ -1433,7 +1433,7 @@
                 <w:b/>
                 <w:sz w:val="17"/>
               </w:rPr>
-              <w:t>isorhamnetin</w:t>
+              <w:t>Isorhamnetin</w:t>
             </w:r>
           </w:p>
         </w:tc>
@@ -2240,7 +2240,7 @@
                 <w:b/>
                 <w:sz w:val="17"/>
               </w:rPr>
-              <w:t>kaempferol</w:t>
+              <w:t>Kaempferol</w:t>
             </w:r>
           </w:p>
         </w:tc>
@@ -2254,7 +2254,7 @@
                 <w:b/>
                 <w:sz w:val="17"/>
               </w:rPr>
-              <w:t>quercetin</w:t>
+              <w:t>Quercetin</w:t>
             </w:r>
           </w:p>
         </w:tc>
@@ -2268,7 +2268,7 @@
                 <w:b/>
                 <w:sz w:val="17"/>
               </w:rPr>
-              <w:t>isorhamnetin</w:t>
+              <w:t>Isorhamnetin</w:t>
             </w:r>
           </w:p>
         </w:tc>
@@ -2967,7 +2967,7 @@
                 <w:b/>
                 <w:sz w:val="17"/>
               </w:rPr>
-              <w:t>kaempferol+H+</w:t>
+              <w:t>Kaempferol+H+</w:t>
             </w:r>
           </w:p>
         </w:tc>
@@ -2981,7 +2981,7 @@
                 <w:b/>
                 <w:sz w:val="17"/>
               </w:rPr>
-              <w:t>quercetin+H+</w:t>
+              <w:t>Quercetin+H+</w:t>
             </w:r>
           </w:p>
         </w:tc>
@@ -2995,7 +2995,7 @@
                 <w:b/>
                 <w:sz w:val="17"/>
               </w:rPr>
-              <w:t>isorhamnetin+H+</w:t>
+              <w:t>Isorhamnetin+H+</w:t>
             </w:r>
           </w:p>
         </w:tc>
@@ -3684,7 +3684,7 @@
                 <w:b/>
                 <w:sz w:val="17"/>
               </w:rPr>
-              <w:t>kaempferol+H+</w:t>
+              <w:t>Kaempferol+H+</w:t>
             </w:r>
           </w:p>
         </w:tc>
@@ -3698,7 +3698,7 @@
                 <w:b/>
                 <w:sz w:val="17"/>
               </w:rPr>
-              <w:t>quercetin+H+</w:t>
+              <w:t>Quercetin+H+</w:t>
             </w:r>
           </w:p>
         </w:tc>
@@ -3712,7 +3712,7 @@
                 <w:b/>
                 <w:sz w:val="17"/>
               </w:rPr>
-              <w:t>isorhamnetin+H+</w:t>
+              <w:t>Isorhamnetin+H+</w:t>
             </w:r>
           </w:p>
         </w:tc>
@@ -4429,7 +4429,7 @@
                 <w:b/>
                 <w:sz w:val="17"/>
               </w:rPr>
-              <w:t>kaempferol</w:t>
+              <w:t>Kaempferol</w:t>
             </w:r>
           </w:p>
         </w:tc>
@@ -4443,7 +4443,7 @@
                 <w:b/>
                 <w:sz w:val="17"/>
               </w:rPr>
-              <w:t>quercetin</w:t>
+              <w:t>Quercetin</w:t>
             </w:r>
           </w:p>
         </w:tc>
@@ -4457,7 +4457,7 @@
                 <w:b/>
                 <w:sz w:val="17"/>
               </w:rPr>
-              <w:t>isorhamnetin</w:t>
+              <w:t>Isorhamnetin</w:t>
             </w:r>
           </w:p>
         </w:tc>
@@ -5311,7 +5311,7 @@
           <w:b/>
           <w:sz w:val="20"/>
         </w:rPr>
-        <w:t>kaempferol</w:t>
+        <w:t>Kaempferol</w:t>
       </w:r>
       <w:r>
         <w:rPr>
@@ -5327,7 +5327,7 @@
           <w:b/>
           <w:sz w:val="20"/>
         </w:rPr>
-        <w:t>quercetin</w:t>
+        <w:t>Quercetin</w:t>
       </w:r>
       <w:r>
         <w:rPr>
@@ -5343,7 +5343,7 @@
           <w:b/>
           <w:sz w:val="20"/>
         </w:rPr>
-        <w:t>isorhamnetin</w:t>
+        <w:t>Isorhamnetin</w:t>
       </w:r>
       <w:r>
         <w:rPr>

</xml_diff>

<commit_message>
feat(qm): add the molecular dipole-moment descriptor (Debye)
Extract the ground-state dipole magnitude from xTB and PySCF (both expose
it from the already-converged density at negligible cost) as
EngineResult.dipole_debye, surface it in the descriptor row, the CSV and
the report table, and label it in DESCRIPTOR_META. The dipole is a
polarity axis independent of the HOMO-LUMO gap.

It is reported for neutral molecules only: the dipole is origin-independent
for a neutral species but gauge-dependent for an ion, so cation rows are
left blank rather than carrying an origin artifact.

Backfill the arghel descriptor matrices (neutral aqueous dipoles 4.4 to
6.3 D) and regenerate the report bundle, which now shows a 'Dipole (D)'
row. Only the dipole column is added; every other value is unchanged.

Co-authored-by: Claude Opus 4.8 (1M context) <noreply@anthropic.com>
</commit_message>
<xml_diff>
--- a/cases/arghel/report/report.docx
+++ b/cases/arghel/report/report.docx
@@ -16,7 +16,7 @@
           <w:b w:val="0"/>
           <w:color w:val="718096"/>
         </w:rPr>
-        <w:t>Substrate: Fe(110)  |  Medium: 1 M HCl  |  DFT level: B3LYP/6-311++G(d,p) (ddCOSMO:water)  |  Generated 2026-07-14 18:07</w:t>
+        <w:t>Substrate: Fe(110)  |  Medium: 1 M HCl  |  DFT level: B3LYP/6-311++G(d,p) (ddCOSMO:water)  |  Generated 2026-07-17 07:38</w:t>
       </w:r>
     </w:p>
     <w:p>
@@ -2029,6 +2029,64 @@
                 <w:b w:val="0"/>
                 <w:sz w:val="17"/>
               </w:rPr>
+              <w:t>Dipole (D)</w:t>
+            </w:r>
+          </w:p>
+        </w:tc>
+        <w:tc>
+          <w:tcPr>
+            <w:tcW w:type="dxa" w:w="2160"/>
+          </w:tcPr>
+          <w:p>
+            <w:r>
+              <w:rPr>
+                <w:b w:val="0"/>
+                <w:sz w:val="17"/>
+              </w:rPr>
+              <w:t>5.531</w:t>
+            </w:r>
+          </w:p>
+        </w:tc>
+        <w:tc>
+          <w:tcPr>
+            <w:tcW w:type="dxa" w:w="2160"/>
+          </w:tcPr>
+          <w:p>
+            <w:r>
+              <w:rPr>
+                <w:b w:val="0"/>
+                <w:sz w:val="17"/>
+              </w:rPr>
+              <w:t>6.337</w:t>
+            </w:r>
+          </w:p>
+        </w:tc>
+        <w:tc>
+          <w:tcPr>
+            <w:tcW w:type="dxa" w:w="2160"/>
+          </w:tcPr>
+          <w:p>
+            <w:r>
+              <w:rPr>
+                <w:b w:val="0"/>
+                <w:sz w:val="17"/>
+              </w:rPr>
+              <w:t>4.42</w:t>
+            </w:r>
+          </w:p>
+        </w:tc>
+      </w:tr>
+      <w:tr>
+        <w:tc>
+          <w:tcPr>
+            <w:tcW w:type="dxa" w:w="2160"/>
+          </w:tcPr>
+          <w:p>
+            <w:r>
+              <w:rPr>
+                <w:b w:val="0"/>
+                <w:sz w:val="17"/>
+              </w:rPr>
               <w:t>TNC</w:t>
             </w:r>
           </w:p>
@@ -2864,6 +2922,64 @@
                 <w:b w:val="0"/>
                 <w:sz w:val="17"/>
               </w:rPr>
+              <w:t>Dipole (D)</w:t>
+            </w:r>
+          </w:p>
+        </w:tc>
+        <w:tc>
+          <w:tcPr>
+            <w:tcW w:type="dxa" w:w="2160"/>
+          </w:tcPr>
+          <w:p>
+            <w:r>
+              <w:rPr>
+                <w:b w:val="0"/>
+                <w:sz w:val="17"/>
+              </w:rPr>
+              <w:t>6.143</w:t>
+            </w:r>
+          </w:p>
+        </w:tc>
+        <w:tc>
+          <w:tcPr>
+            <w:tcW w:type="dxa" w:w="2160"/>
+          </w:tcPr>
+          <w:p>
+            <w:r>
+              <w:rPr>
+                <w:b w:val="0"/>
+                <w:sz w:val="17"/>
+              </w:rPr>
+              <w:t>8.021</w:t>
+            </w:r>
+          </w:p>
+        </w:tc>
+        <w:tc>
+          <w:tcPr>
+            <w:tcW w:type="dxa" w:w="2160"/>
+          </w:tcPr>
+          <w:p>
+            <w:r>
+              <w:rPr>
+                <w:b w:val="0"/>
+                <w:sz w:val="17"/>
+              </w:rPr>
+              <w:t>3.468</w:t>
+            </w:r>
+          </w:p>
+        </w:tc>
+      </w:tr>
+      <w:tr>
+        <w:tc>
+          <w:tcPr>
+            <w:tcW w:type="dxa" w:w="2160"/>
+          </w:tcPr>
+          <w:p>
+            <w:r>
+              <w:rPr>
+                <w:b w:val="0"/>
+                <w:sz w:val="17"/>
+              </w:rPr>
               <w:t>TNC</w:t>
             </w:r>
           </w:p>
@@ -3591,6 +3707,61 @@
                 <w:b w:val="0"/>
                 <w:sz w:val="17"/>
               </w:rPr>
+              <w:t>Dipole (D)</w:t>
+            </w:r>
+          </w:p>
+        </w:tc>
+        <w:tc>
+          <w:tcPr>
+            <w:tcW w:type="dxa" w:w="2160"/>
+          </w:tcPr>
+          <w:p>
+            <w:r>
+              <w:rPr>
+                <w:b w:val="0"/>
+                <w:sz w:val="17"/>
+              </w:rPr>
+            </w:r>
+          </w:p>
+        </w:tc>
+        <w:tc>
+          <w:tcPr>
+            <w:tcW w:type="dxa" w:w="2160"/>
+          </w:tcPr>
+          <w:p>
+            <w:r>
+              <w:rPr>
+                <w:b w:val="0"/>
+                <w:sz w:val="17"/>
+              </w:rPr>
+            </w:r>
+          </w:p>
+        </w:tc>
+        <w:tc>
+          <w:tcPr>
+            <w:tcW w:type="dxa" w:w="2160"/>
+          </w:tcPr>
+          <w:p>
+            <w:r>
+              <w:rPr>
+                <w:b w:val="0"/>
+                <w:sz w:val="17"/>
+              </w:rPr>
+            </w:r>
+          </w:p>
+        </w:tc>
+      </w:tr>
+      <w:tr>
+        <w:tc>
+          <w:tcPr>
+            <w:tcW w:type="dxa" w:w="2160"/>
+          </w:tcPr>
+          <w:p>
+            <w:r>
+              <w:rPr>
+                <w:b w:val="0"/>
+                <w:sz w:val="17"/>
+              </w:rPr>
               <w:t>TNC</w:t>
             </w:r>
           </w:p>
@@ -4293,6 +4464,61 @@
                 <w:sz w:val="17"/>
               </w:rPr>
               <w:t>-0.391</w:t>
+            </w:r>
+          </w:p>
+        </w:tc>
+      </w:tr>
+      <w:tr>
+        <w:tc>
+          <w:tcPr>
+            <w:tcW w:type="dxa" w:w="2160"/>
+          </w:tcPr>
+          <w:p>
+            <w:r>
+              <w:rPr>
+                <w:b w:val="0"/>
+                <w:sz w:val="17"/>
+              </w:rPr>
+              <w:t>Dipole (D)</w:t>
+            </w:r>
+          </w:p>
+        </w:tc>
+        <w:tc>
+          <w:tcPr>
+            <w:tcW w:type="dxa" w:w="2160"/>
+          </w:tcPr>
+          <w:p>
+            <w:r>
+              <w:rPr>
+                <w:b w:val="0"/>
+                <w:sz w:val="17"/>
+              </w:rPr>
+            </w:r>
+          </w:p>
+        </w:tc>
+        <w:tc>
+          <w:tcPr>
+            <w:tcW w:type="dxa" w:w="2160"/>
+          </w:tcPr>
+          <w:p>
+            <w:r>
+              <w:rPr>
+                <w:b w:val="0"/>
+                <w:sz w:val="17"/>
+              </w:rPr>
+            </w:r>
+          </w:p>
+        </w:tc>
+        <w:tc>
+          <w:tcPr>
+            <w:tcW w:type="dxa" w:w="2160"/>
+          </w:tcPr>
+          <w:p>
+            <w:r>
+              <w:rPr>
+                <w:b w:val="0"/>
+                <w:sz w:val="17"/>
+              </w:rPr>
             </w:r>
           </w:p>
         </w:tc>
@@ -5038,6 +5264,64 @@
                 <w:sz w:val="17"/>
               </w:rPr>
               <w:t>-0.509</w:t>
+            </w:r>
+          </w:p>
+        </w:tc>
+      </w:tr>
+      <w:tr>
+        <w:tc>
+          <w:tcPr>
+            <w:tcW w:type="dxa" w:w="2160"/>
+          </w:tcPr>
+          <w:p>
+            <w:r>
+              <w:rPr>
+                <w:b w:val="0"/>
+                <w:sz w:val="17"/>
+              </w:rPr>
+              <w:t>Dipole (D)</w:t>
+            </w:r>
+          </w:p>
+        </w:tc>
+        <w:tc>
+          <w:tcPr>
+            <w:tcW w:type="dxa" w:w="2160"/>
+          </w:tcPr>
+          <w:p>
+            <w:r>
+              <w:rPr>
+                <w:b w:val="0"/>
+                <w:sz w:val="17"/>
+              </w:rPr>
+              <w:t>5.531</w:t>
+            </w:r>
+          </w:p>
+        </w:tc>
+        <w:tc>
+          <w:tcPr>
+            <w:tcW w:type="dxa" w:w="2160"/>
+          </w:tcPr>
+          <w:p>
+            <w:r>
+              <w:rPr>
+                <w:b w:val="0"/>
+                <w:sz w:val="17"/>
+              </w:rPr>
+              <w:t>6.337</w:t>
+            </w:r>
+          </w:p>
+        </w:tc>
+        <w:tc>
+          <w:tcPr>
+            <w:tcW w:type="dxa" w:w="2160"/>
+          </w:tcPr>
+          <w:p>
+            <w:r>
+              <w:rPr>
+                <w:b w:val="0"/>
+                <w:sz w:val="17"/>
+              </w:rPr>
+              <w:t>4.42</w:t>
             </w:r>
           </w:p>
         </w:tc>

</xml_diff>